<commit_message>
Update AI generation timing explanations to accurately reflect micro-batch top-up iterations
</commit_message>
<xml_diff>
--- a/Reviso_AI_Architecture_Layman_and_Technical_Versions.docx
+++ b/Reviso_AI_Architecture_Layman_and_Technical_Versions.docx
@@ -218,7 +218,7 @@
           <w:color w:val="222222"/>
           <w:sz w:val="22"/>
         </w:rPr>
-        <w:t xml:space="preserve">1. Blazing Fast Speed: </w:t>
+        <w:t xml:space="preserve">1. High-Throughput Micro-Batching: </w:t>
       </w:r>
       <w:r>
         <w:rPr>
@@ -226,7 +226,7 @@
           <w:color w:val="222222"/>
           <w:sz w:val="22"/>
         </w:rPr>
-        <w:t>Instead of taking 1 to 2 minutes like standard online chatbots, Reviso generates 30 to 50 board-exam quality questions in just 4 to 8 seconds by splitting the work into parallel micro-jobs.</w:t>
+        <w:t>By utilizing a lightweight 3B model with parallel micro-batch processing, the system generates questions in small, manageable batches with iterative top-up and deduplication passes, preventing server timeouts even for large 50 to 60-item exams.</w:t>
       </w:r>
     </w:p>
     <w:p>
@@ -568,7 +568,7 @@
                 <w:color w:val="222222"/>
                 <w:sz w:val="19"/>
               </w:rPr>
-              <w:t>Generation Speed</w:t>
+              <w:t>Generation Architecture</w:t>
             </w:r>
           </w:p>
         </w:tc>
@@ -587,7 +587,7 @@
                 <w:color w:val="222222"/>
                 <w:sz w:val="19"/>
               </w:rPr>
-              <w:t>Slow (45 to 90 seconds for 50 items)</w:t>
+              <w:t>Monolithic Single-Prompt (High timeout risk on 50-60 items)</w:t>
             </w:r>
           </w:p>
         </w:tc>
@@ -606,7 +606,7 @@
                 <w:color w:val="222222"/>
                 <w:sz w:val="19"/>
               </w:rPr>
-              <w:t>Ultra-Fast (4 to 8 seconds via parallel pooling)</w:t>
+              <w:t>Micro-Batch Parallel Pooling (Iterative top-up and validation passes)</w:t>
             </w:r>
           </w:p>
         </w:tc>
@@ -1059,7 +1059,7 @@
           <w:color w:val="222222"/>
           <w:sz w:val="22"/>
         </w:rPr>
-        <w:t>Rather than serializing LLM generation via a single monolithic prompt (which incurs quadratic attention complexity O(n^2) over long context windows and high latency timeouts), Reviso executes item generation through asynchronous HTTP pooling (Http::pool). The system partitions the target question volume into concurrent micro-tasks (1 to 2 items per prompt) executed simultaneously across Cloudflare edge workers, reducing aggregate latency for a 50-item exam from 75+ seconds to 4.2–7.8 seconds.</w:t>
+        <w:t>Rather than serializing LLM generation via a single monolithic prompt (which incurs quadratic attention complexity O(n^2) over long context windows and high latency timeouts), Reviso executes item generation through asynchronous HTTP pooling (Http::pool) combined with iterative top-up validation cycles. The system partitions the target question volume into concurrent micro-tasks (1 to 2 items per prompt) executed across Cloudflare edge workers, ensuring high resilience and preventing gateway timeouts even for comprehensive 50 to 60+ item assessments.</w:t>
       </w:r>
     </w:p>
     <w:p>

</xml_diff>